<commit_message>
Day 2: Spanish toggle, history accuracy and wording audit
- Add English/Spanish language toggle for all student-facing text
- Stamp Act: tax paid for ~10,000 troops kept in America; note the
  Declaratory Act alongside repeal; add Britain's "Parliament speaks
  for the whole empire" view
- Fix hero caption (Bradford paused printing, day before the tax began),
  merchant/farmer/lawyer feedback, cartoon made in London
- Smooth wording of statements 1, 4, 6 and sync the teacher answer key
- Spanish: "le afectó" instead of "le pegó"

Co-Authored-By: Claude Opus 5.5 (1M context) <noreply@anthropic.com>
</commit_message>
<xml_diff>
--- a/road-to-revolution/Day2_Response_Sheet.docx
+++ b/road-to-revolution/Day2_Response_Sheet.docx
@@ -799,7 +799,7 @@
                 <w:i w:val="0"/>
                 <w:sz w:val="18"/>
               </w:rPr>
-              <w:t xml:space="preserve">The king is our king. We should obey… </w:t>
+              <w:t xml:space="preserve">The king is our ruler. We should obey… </w:t>
             </w:r>
             <w:r>
               <w:rPr>
@@ -840,7 +840,7 @@
                 <w:i w:val="0"/>
                 <w:sz w:val="18"/>
               </w:rPr>
-              <w:t xml:space="preserve">Both sides shout too much. Let us wait and see… </w:t>
+              <w:t xml:space="preserve">Both sides shout too much. I will wait and see… </w:t>
             </w:r>
             <w:r>
               <w:rPr>
@@ -1051,7 +1051,7 @@
                 <w:i w:val="0"/>
                 <w:sz w:val="18"/>
               </w:rPr>
-              <w:t xml:space="preserve">Let us stop buying British goods… </w:t>
+              <w:t xml:space="preserve">We should stop buying British goods… </w:t>
             </w:r>
             <w:r>
               <w:rPr>

</xml_diff>